<commit_message>
Numrera betygskriterier (K) och centralt innehåll (CI)
- kursplan-gy11/gy25.md: varje mening i betygskriterierna märkt K1, K2 …,
  centralt innehåll CI1, CI2 …, nummertabell och numrerad progression
- kriterier-gy11/gy25.json: numren med korta namn
- Facit får en översikt över vilka K och CI varje del prövar
- Båda proven kodade med K- och CI-nummer

Co-Authored-By: Claude Opus 5.5 <noreply@anthropic.com>
Claude-Session: https://claude.ai/code/session_01SkwDVysSJuMmZkNxibrjVq
</commit_message>
<xml_diff>
--- a/prov/det-langa-1800-talet-gy11/det-langa-1800-talet-gy11_facit.docx
+++ b/prov/det-langa-1800-talet-gy11/det-langa-1800-talet-gy11_facit.docx
@@ -45,6 +45,727 @@
     <w:p>
       <w:pPr>
         <w:keepNext/>
+        <w:spacing w:before="160" w:after="40"/>
+      </w:pPr>
+      <w:r>
+        <w:rPr>
+          <w:b/>
+          <w:sz w:val="22"/>
+        </w:rPr>
+        <w:t>Betygskriterier som prövas (kursplan Gy-11)</w:t>
+      </w:r>
+    </w:p>
+    <w:tbl>
+      <w:tblPr>
+        <w:tblStyle w:val="TableGrid"/>
+        <w:tblW w:type="auto" w:w="0"/>
+        <w:tblLook w:firstColumn="1" w:firstRow="1" w:lastColumn="0" w:lastRow="0" w:noHBand="0" w:noVBand="1" w:val="04A0"/>
+      </w:tblPr>
+      <w:tblGrid>
+        <w:gridCol w:w="3137"/>
+        <w:gridCol w:w="3137"/>
+        <w:gridCol w:w="3137"/>
+      </w:tblGrid>
+      <w:tr>
+        <w:tc>
+          <w:tcPr>
+            <w:tcW w:type="dxa" w:w="794"/>
+          </w:tcPr>
+          <w:p>
+            <w:r>
+              <w:rPr>
+                <w:b/>
+              </w:rPr>
+              <w:t>Nr</w:t>
+            </w:r>
+          </w:p>
+        </w:tc>
+        <w:tc>
+          <w:tcPr>
+            <w:tcW w:type="dxa" w:w="7030"/>
+          </w:tcPr>
+          <w:p>
+            <w:r>
+              <w:rPr>
+                <w:b/>
+              </w:rPr>
+              <w:t>Innehåll</w:t>
+            </w:r>
+          </w:p>
+        </w:tc>
+        <w:tc>
+          <w:tcPr>
+            <w:tcW w:type="dxa" w:w="1587"/>
+          </w:tcPr>
+          <w:p>
+            <w:r>
+              <w:rPr>
+                <w:b/>
+              </w:rPr>
+              <w:t>Prövas i del</w:t>
+            </w:r>
+          </w:p>
+        </w:tc>
+      </w:tr>
+      <w:tr>
+        <w:tc>
+          <w:tcPr>
+            <w:tcW w:type="dxa" w:w="794"/>
+          </w:tcPr>
+          <w:p>
+            <w:r>
+              <w:rPr>
+                <w:b/>
+              </w:rPr>
+              <w:t>K1</w:t>
+            </w:r>
+          </w:p>
+        </w:tc>
+        <w:tc>
+          <w:tcPr>
+            <w:tcW w:type="dxa" w:w="7030"/>
+          </w:tcPr>
+          <w:p>
+            <w:r>
+              <w:rPr>
+                <w:sz w:val="20"/>
+              </w:rPr>
+              <w:t>Förändringsprocesser, händelser och personer samt olika tolkningar av dem</w:t>
+            </w:r>
+          </w:p>
+        </w:tc>
+        <w:tc>
+          <w:tcPr>
+            <w:tcW w:type="dxa" w:w="1587"/>
+          </w:tcPr>
+          <w:p>
+            <w:r>
+              <w:rPr>
+                <w:sz w:val="20"/>
+              </w:rPr>
+              <w:t>1, 2, 4, 5</w:t>
+            </w:r>
+          </w:p>
+        </w:tc>
+      </w:tr>
+      <w:tr>
+        <w:tc>
+          <w:tcPr>
+            <w:tcW w:type="dxa" w:w="794"/>
+          </w:tcPr>
+          <w:p>
+            <w:r>
+              <w:rPr>
+                <w:b/>
+              </w:rPr>
+              <w:t>K2</w:t>
+            </w:r>
+          </w:p>
+        </w:tc>
+        <w:tc>
+          <w:tcPr>
+            <w:tcW w:type="dxa" w:w="7030"/>
+          </w:tcPr>
+          <w:p>
+            <w:r>
+              <w:rPr>
+                <w:sz w:val="20"/>
+              </w:rPr>
+              <w:t>Förlopp, orsaker och konsekvenser</w:t>
+            </w:r>
+          </w:p>
+        </w:tc>
+        <w:tc>
+          <w:tcPr>
+            <w:tcW w:type="dxa" w:w="1587"/>
+          </w:tcPr>
+          <w:p>
+            <w:r>
+              <w:rPr>
+                <w:sz w:val="20"/>
+              </w:rPr>
+              <w:t>1, 4, 5</w:t>
+            </w:r>
+          </w:p>
+        </w:tc>
+      </w:tr>
+      <w:tr>
+        <w:tc>
+          <w:tcPr>
+            <w:tcW w:type="dxa" w:w="794"/>
+          </w:tcPr>
+          <w:p>
+            <w:r>
+              <w:rPr>
+                <w:b/>
+              </w:rPr>
+              <w:t>K3</w:t>
+            </w:r>
+          </w:p>
+        </w:tc>
+        <w:tc>
+          <w:tcPr>
+            <w:tcW w:type="dxa" w:w="7030"/>
+          </w:tcPr>
+          <w:p>
+            <w:r>
+              <w:rPr>
+                <w:sz w:val="20"/>
+              </w:rPr>
+              <w:t>Enskilda personers betydelse för skeenden</w:t>
+            </w:r>
+          </w:p>
+        </w:tc>
+        <w:tc>
+          <w:tcPr>
+            <w:tcW w:type="dxa" w:w="1587"/>
+          </w:tcPr>
+          <w:p>
+            <w:r>
+              <w:rPr>
+                <w:sz w:val="20"/>
+              </w:rPr>
+              <w:t>5</w:t>
+            </w:r>
+          </w:p>
+        </w:tc>
+      </w:tr>
+      <w:tr>
+        <w:tc>
+          <w:tcPr>
+            <w:tcW w:type="dxa" w:w="794"/>
+          </w:tcPr>
+          <w:p>
+            <w:r>
+              <w:rPr>
+                <w:b/>
+              </w:rPr>
+              <w:t>K4</w:t>
+            </w:r>
+          </w:p>
+        </w:tc>
+        <w:tc>
+          <w:tcPr>
+            <w:tcW w:type="dxa" w:w="7030"/>
+          </w:tcPr>
+          <w:p>
+            <w:r>
+              <w:rPr>
+                <w:sz w:val="20"/>
+              </w:rPr>
+              <w:t>Samband mellan det förflutna och nutiden</w:t>
+            </w:r>
+          </w:p>
+        </w:tc>
+        <w:tc>
+          <w:tcPr>
+            <w:tcW w:type="dxa" w:w="1587"/>
+          </w:tcPr>
+          <w:p>
+            <w:r>
+              <w:rPr>
+                <w:sz w:val="20"/>
+              </w:rPr>
+              <w:t>3, 4</w:t>
+            </w:r>
+          </w:p>
+        </w:tc>
+      </w:tr>
+      <w:tr>
+        <w:tc>
+          <w:tcPr>
+            <w:tcW w:type="dxa" w:w="794"/>
+          </w:tcPr>
+          <w:p>
+            <w:r>
+              <w:rPr>
+                <w:b/>
+                <w:color w:val="555555"/>
+              </w:rPr>
+              <w:t>K5</w:t>
+            </w:r>
+          </w:p>
+        </w:tc>
+        <w:tc>
+          <w:tcPr>
+            <w:tcW w:type="dxa" w:w="7030"/>
+          </w:tcPr>
+          <w:p>
+            <w:r>
+              <w:rPr>
+                <w:color w:val="555555"/>
+                <w:sz w:val="20"/>
+              </w:rPr>
+              <w:t>Slutsatser om betydelse för framtiden</w:t>
+            </w:r>
+          </w:p>
+        </w:tc>
+        <w:tc>
+          <w:tcPr>
+            <w:tcW w:type="dxa" w:w="1587"/>
+          </w:tcPr>
+          <w:p>
+            <w:r>
+              <w:rPr>
+                <w:color w:val="555555"/>
+                <w:sz w:val="20"/>
+              </w:rPr>
+              <w:t>–</w:t>
+            </w:r>
+          </w:p>
+        </w:tc>
+      </w:tr>
+      <w:tr>
+        <w:tc>
+          <w:tcPr>
+            <w:tcW w:type="dxa" w:w="794"/>
+          </w:tcPr>
+          <w:p>
+            <w:r>
+              <w:rPr>
+                <w:b/>
+              </w:rPr>
+              <w:t>K6</w:t>
+            </w:r>
+          </w:p>
+        </w:tc>
+        <w:tc>
+          <w:tcPr>
+            <w:tcW w:type="dxa" w:w="7030"/>
+          </w:tcPr>
+          <w:p>
+            <w:r>
+              <w:rPr>
+                <w:sz w:val="20"/>
+              </w:rPr>
+              <w:t>Historiska begrepp</w:t>
+            </w:r>
+          </w:p>
+        </w:tc>
+        <w:tc>
+          <w:tcPr>
+            <w:tcW w:type="dxa" w:w="1587"/>
+          </w:tcPr>
+          <w:p>
+            <w:r>
+              <w:rPr>
+                <w:sz w:val="20"/>
+              </w:rPr>
+              <w:t>4, 5</w:t>
+            </w:r>
+          </w:p>
+        </w:tc>
+      </w:tr>
+      <w:tr>
+        <w:tc>
+          <w:tcPr>
+            <w:tcW w:type="dxa" w:w="794"/>
+          </w:tcPr>
+          <w:p>
+            <w:r>
+              <w:rPr>
+                <w:b/>
+                <w:color w:val="555555"/>
+              </w:rPr>
+              <w:t>K7</w:t>
+            </w:r>
+          </w:p>
+        </w:tc>
+        <w:tc>
+          <w:tcPr>
+            <w:tcW w:type="dxa" w:w="7030"/>
+          </w:tcPr>
+          <w:p>
+            <w:r>
+              <w:rPr>
+                <w:color w:val="555555"/>
+                <w:sz w:val="20"/>
+              </w:rPr>
+              <w:t>Källmaterial och källkritik</w:t>
+            </w:r>
+          </w:p>
+        </w:tc>
+        <w:tc>
+          <w:tcPr>
+            <w:tcW w:type="dxa" w:w="1587"/>
+          </w:tcPr>
+          <w:p>
+            <w:r>
+              <w:rPr>
+                <w:color w:val="555555"/>
+                <w:sz w:val="20"/>
+              </w:rPr>
+              <w:t>–</w:t>
+            </w:r>
+          </w:p>
+        </w:tc>
+      </w:tr>
+      <w:tr>
+        <w:tc>
+          <w:tcPr>
+            <w:tcW w:type="dxa" w:w="794"/>
+          </w:tcPr>
+          <w:p>
+            <w:r>
+              <w:rPr>
+                <w:b/>
+              </w:rPr>
+              <w:t>K8</w:t>
+            </w:r>
+          </w:p>
+        </w:tc>
+        <w:tc>
+          <w:tcPr>
+            <w:tcW w:type="dxa" w:w="7030"/>
+          </w:tcPr>
+          <w:p>
+            <w:r>
+              <w:rPr>
+                <w:sz w:val="20"/>
+              </w:rPr>
+              <w:t>Historiebruk</w:t>
+            </w:r>
+          </w:p>
+        </w:tc>
+        <w:tc>
+          <w:tcPr>
+            <w:tcW w:type="dxa" w:w="1587"/>
+          </w:tcPr>
+          <w:p>
+            <w:r>
+              <w:rPr>
+                <w:sz w:val="20"/>
+              </w:rPr>
+              <w:t>3</w:t>
+            </w:r>
+          </w:p>
+        </w:tc>
+      </w:tr>
+    </w:tbl>
+    <w:p>
+      <w:pPr>
+        <w:keepNext/>
+        <w:spacing w:before="160" w:after="40"/>
+      </w:pPr>
+      <w:r>
+        <w:rPr>
+          <w:b/>
+          <w:sz w:val="22"/>
+        </w:rPr>
+        <w:t>Centralt innehåll som prövas (kursplan Gy-11)</w:t>
+      </w:r>
+    </w:p>
+    <w:tbl>
+      <w:tblPr>
+        <w:tblStyle w:val="TableGrid"/>
+        <w:tblW w:type="auto" w:w="0"/>
+        <w:tblLook w:firstColumn="1" w:firstRow="1" w:lastColumn="0" w:lastRow="0" w:noHBand="0" w:noVBand="1" w:val="04A0"/>
+      </w:tblPr>
+      <w:tblGrid>
+        <w:gridCol w:w="3137"/>
+        <w:gridCol w:w="3137"/>
+        <w:gridCol w:w="3137"/>
+      </w:tblGrid>
+      <w:tr>
+        <w:tc>
+          <w:tcPr>
+            <w:tcW w:type="dxa" w:w="794"/>
+          </w:tcPr>
+          <w:p>
+            <w:r>
+              <w:rPr>
+                <w:b/>
+              </w:rPr>
+              <w:t>Nr</w:t>
+            </w:r>
+          </w:p>
+        </w:tc>
+        <w:tc>
+          <w:tcPr>
+            <w:tcW w:type="dxa" w:w="7030"/>
+          </w:tcPr>
+          <w:p>
+            <w:r>
+              <w:rPr>
+                <w:b/>
+              </w:rPr>
+              <w:t>Innehåll</w:t>
+            </w:r>
+          </w:p>
+        </w:tc>
+        <w:tc>
+          <w:tcPr>
+            <w:tcW w:type="dxa" w:w="1587"/>
+          </w:tcPr>
+          <w:p>
+            <w:r>
+              <w:rPr>
+                <w:b/>
+              </w:rPr>
+              <w:t>Prövas i del</w:t>
+            </w:r>
+          </w:p>
+        </w:tc>
+      </w:tr>
+      <w:tr>
+        <w:tc>
+          <w:tcPr>
+            <w:tcW w:type="dxa" w:w="794"/>
+          </w:tcPr>
+          <w:p>
+            <w:r>
+              <w:rPr>
+                <w:b/>
+                <w:color w:val="555555"/>
+              </w:rPr>
+              <w:t>CI1</w:t>
+            </w:r>
+          </w:p>
+        </w:tc>
+        <w:tc>
+          <w:tcPr>
+            <w:tcW w:type="dxa" w:w="7030"/>
+          </w:tcPr>
+          <w:p>
+            <w:r>
+              <w:rPr>
+                <w:color w:val="555555"/>
+                <w:sz w:val="20"/>
+              </w:rPr>
+              <w:t>Europeisk epokindelning och problematisering av tidsindelningar</w:t>
+            </w:r>
+          </w:p>
+        </w:tc>
+        <w:tc>
+          <w:tcPr>
+            <w:tcW w:type="dxa" w:w="1587"/>
+          </w:tcPr>
+          <w:p>
+            <w:r>
+              <w:rPr>
+                <w:color w:val="555555"/>
+                <w:sz w:val="20"/>
+              </w:rPr>
+              <w:t>–</w:t>
+            </w:r>
+          </w:p>
+        </w:tc>
+      </w:tr>
+      <w:tr>
+        <w:tc>
+          <w:tcPr>
+            <w:tcW w:type="dxa" w:w="794"/>
+          </w:tcPr>
+          <w:p>
+            <w:r>
+              <w:rPr>
+                <w:b/>
+              </w:rPr>
+              <w:t>CI2</w:t>
+            </w:r>
+          </w:p>
+        </w:tc>
+        <w:tc>
+          <w:tcPr>
+            <w:tcW w:type="dxa" w:w="7030"/>
+          </w:tcPr>
+          <w:p>
+            <w:r>
+              <w:rPr>
+                <w:sz w:val="20"/>
+              </w:rPr>
+              <w:t>Industrialisering, demokratisering och globala förändringsprocesser; förändrade maktförhållanden och förklaringar till dem</w:t>
+            </w:r>
+          </w:p>
+        </w:tc>
+        <w:tc>
+          <w:tcPr>
+            <w:tcW w:type="dxa" w:w="1587"/>
+          </w:tcPr>
+          <w:p>
+            <w:r>
+              <w:rPr>
+                <w:sz w:val="20"/>
+              </w:rPr>
+              <w:t>1, 2, 4, 5</w:t>
+            </w:r>
+          </w:p>
+        </w:tc>
+      </w:tr>
+      <w:tr>
+        <w:tc>
+          <w:tcPr>
+            <w:tcW w:type="dxa" w:w="794"/>
+          </w:tcPr>
+          <w:p>
+            <w:r>
+              <w:rPr>
+                <w:b/>
+              </w:rPr>
+              <w:t>CI3</w:t>
+            </w:r>
+          </w:p>
+        </w:tc>
+        <w:tc>
+          <w:tcPr>
+            <w:tcW w:type="dxa" w:w="7030"/>
+          </w:tcPr>
+          <w:p>
+            <w:r>
+              <w:rPr>
+                <w:sz w:val="20"/>
+              </w:rPr>
+              <w:t>Långsiktiga förändringsprocesser – kontinuitet och förändring</w:t>
+            </w:r>
+          </w:p>
+        </w:tc>
+        <w:tc>
+          <w:tcPr>
+            <w:tcW w:type="dxa" w:w="1587"/>
+          </w:tcPr>
+          <w:p>
+            <w:r>
+              <w:rPr>
+                <w:sz w:val="20"/>
+              </w:rPr>
+              <w:t>2, 4, 5</w:t>
+            </w:r>
+          </w:p>
+        </w:tc>
+      </w:tr>
+      <w:tr>
+        <w:tc>
+          <w:tcPr>
+            <w:tcW w:type="dxa" w:w="794"/>
+          </w:tcPr>
+          <w:p>
+            <w:r>
+              <w:rPr>
+                <w:b/>
+                <w:color w:val="555555"/>
+              </w:rPr>
+              <w:t>CI4</w:t>
+            </w:r>
+          </w:p>
+        </w:tc>
+        <w:tc>
+          <w:tcPr>
+            <w:tcW w:type="dxa" w:w="7030"/>
+          </w:tcPr>
+          <w:p>
+            <w:r>
+              <w:rPr>
+                <w:color w:val="555555"/>
+                <w:sz w:val="20"/>
+              </w:rPr>
+              <w:t>Källmaterial om människors roll; olika perspektiv</w:t>
+            </w:r>
+          </w:p>
+        </w:tc>
+        <w:tc>
+          <w:tcPr>
+            <w:tcW w:type="dxa" w:w="1587"/>
+          </w:tcPr>
+          <w:p>
+            <w:r>
+              <w:rPr>
+                <w:color w:val="555555"/>
+                <w:sz w:val="20"/>
+              </w:rPr>
+              <w:t>–</w:t>
+            </w:r>
+          </w:p>
+        </w:tc>
+      </w:tr>
+      <w:tr>
+        <w:tc>
+          <w:tcPr>
+            <w:tcW w:type="dxa" w:w="794"/>
+          </w:tcPr>
+          <w:p>
+            <w:r>
+              <w:rPr>
+                <w:b/>
+                <w:color w:val="555555"/>
+              </w:rPr>
+              <w:t>CI5</w:t>
+            </w:r>
+          </w:p>
+        </w:tc>
+        <w:tc>
+          <w:tcPr>
+            <w:tcW w:type="dxa" w:w="7030"/>
+          </w:tcPr>
+          <w:p>
+            <w:r>
+              <w:rPr>
+                <w:color w:val="555555"/>
+                <w:sz w:val="20"/>
+              </w:rPr>
+              <w:t>Kritisk granskning av källmaterial</w:t>
+            </w:r>
+          </w:p>
+        </w:tc>
+        <w:tc>
+          <w:tcPr>
+            <w:tcW w:type="dxa" w:w="1587"/>
+          </w:tcPr>
+          <w:p>
+            <w:r>
+              <w:rPr>
+                <w:color w:val="555555"/>
+                <w:sz w:val="20"/>
+              </w:rPr>
+              <w:t>–</w:t>
+            </w:r>
+          </w:p>
+        </w:tc>
+      </w:tr>
+      <w:tr>
+        <w:tc>
+          <w:tcPr>
+            <w:tcW w:type="dxa" w:w="794"/>
+          </w:tcPr>
+          <w:p>
+            <w:r>
+              <w:rPr>
+                <w:b/>
+              </w:rPr>
+              <w:t>CI6</w:t>
+            </w:r>
+          </w:p>
+        </w:tc>
+        <w:tc>
+          <w:tcPr>
+            <w:tcW w:type="dxa" w:w="7030"/>
+          </w:tcPr>
+          <w:p>
+            <w:r>
+              <w:rPr>
+                <w:sz w:val="20"/>
+              </w:rPr>
+              <w:t>Historiebruk och identitet</w:t>
+            </w:r>
+          </w:p>
+        </w:tc>
+        <w:tc>
+          <w:tcPr>
+            <w:tcW w:type="dxa" w:w="1587"/>
+          </w:tcPr>
+          <w:p>
+            <w:r>
+              <w:rPr>
+                <w:sz w:val="20"/>
+              </w:rPr>
+              <w:t>3</w:t>
+            </w:r>
+          </w:p>
+        </w:tc>
+      </w:tr>
+    </w:tbl>
+    <w:p>
+      <w:pPr>
+        <w:keepNext/>
         <w:spacing w:before="280" w:after="120"/>
       </w:pPr>
       <w:r>
@@ -53,6 +774,34 @@
           <w:sz w:val="25"/>
         </w:rPr>
         <w:t>1. Välj rätt alternativ.  (15 p)</w:t>
+      </w:r>
+    </w:p>
+    <w:p>
+      <w:pPr>
+        <w:keepNext w:val="0"/>
+        <w:spacing w:before="0" w:after="40"/>
+      </w:pPr>
+      <w:r>
+        <w:rPr>
+          <w:b w:val="0"/>
+          <w:color w:val="555555"/>
+          <w:sz w:val="20"/>
+        </w:rPr>
+        <w:t>Betygskriterier: K1 Förändringsprocesser, händelser och personer samt olika tolkningar av dem; K2 Förlopp, orsaker och konsekvenser</w:t>
+      </w:r>
+    </w:p>
+    <w:p>
+      <w:pPr>
+        <w:keepNext w:val="0"/>
+        <w:spacing w:before="0" w:after="40"/>
+      </w:pPr>
+      <w:r>
+        <w:rPr>
+          <w:b w:val="0"/>
+          <w:color w:val="555555"/>
+          <w:sz w:val="20"/>
+        </w:rPr>
+        <w:t>Centralt innehåll: CI2 Industrialisering, demokratisering och globala förändringsprocesser; förändrade maktförhållanden och förklaringar till dem</w:t>
       </w:r>
     </w:p>
     <w:p>
@@ -865,6 +1614,34 @@
     </w:p>
     <w:p>
       <w:pPr>
+        <w:keepNext w:val="0"/>
+        <w:spacing w:before="0" w:after="40"/>
+      </w:pPr>
+      <w:r>
+        <w:rPr>
+          <w:b w:val="0"/>
+          <w:color w:val="555555"/>
+          <w:sz w:val="20"/>
+        </w:rPr>
+        <w:t>Betygskriterier: K1 Förändringsprocesser, händelser och personer samt olika tolkningar av dem</w:t>
+      </w:r>
+    </w:p>
+    <w:p>
+      <w:pPr>
+        <w:keepNext w:val="0"/>
+        <w:spacing w:before="0" w:after="40"/>
+      </w:pPr>
+      <w:r>
+        <w:rPr>
+          <w:b w:val="0"/>
+          <w:color w:val="555555"/>
+          <w:sz w:val="20"/>
+        </w:rPr>
+        <w:t>Centralt innehåll: CI2 Industrialisering, demokratisering och globala förändringsprocesser; förändrade maktförhållanden och förklaringar till dem; CI3 Långsiktiga förändringsprocesser – kontinuitet och förändring</w:t>
+      </w:r>
+    </w:p>
+    <w:p>
+      <w:pPr>
         <w:keepNext/>
         <w:spacing w:before="120" w:after="0"/>
       </w:pPr>
@@ -1015,9 +1792,9 @@
         <w:rPr>
           <w:b w:val="0"/>
           <w:color w:val="555555"/>
-          <w:sz w:val="21"/>
+          <w:sz w:val="20"/>
         </w:rPr>
-        <w:t>Betygskriterier som prövas: historiebruk, samband dåtid–nutid</w:t>
+        <w:t>Betygskriterier: K4 Samband mellan det förflutna och nutiden; K8 Historiebruk</w:t>
       </w:r>
     </w:p>
     <w:p>
@@ -1029,9 +1806,9 @@
         <w:rPr>
           <w:b w:val="0"/>
           <w:color w:val="555555"/>
-          <w:sz w:val="21"/>
+          <w:sz w:val="20"/>
         </w:rPr>
-        <w:t>Centralt innehåll: Hur individer och grupper använt historia i samhällsliv och politik, Historiens betydelse för identiteter och gemensamma kulturarv</w:t>
+        <w:t>Centralt innehåll: CI6 Historiebruk och identitet</w:t>
       </w:r>
     </w:p>
     <w:p>
@@ -1235,7 +2012,7 @@
         <w:rPr>
           <w:b w:val="0"/>
           <w:color w:val="555555"/>
-          <w:sz w:val="21"/>
+          <w:sz w:val="20"/>
         </w:rPr>
         <w:t>Historiska begrepp: orsak, konsekvens, kontinuitet, förändring</w:t>
       </w:r>
@@ -1249,9 +2026,9 @@
         <w:rPr>
           <w:b w:val="0"/>
           <w:color w:val="555555"/>
-          <w:sz w:val="21"/>
+          <w:sz w:val="20"/>
         </w:rPr>
-        <w:t>Betygskriterier som prövas: förändringsprocesser och händelser, orsaker och konsekvenser, samband dåtid–nutid, historiska begrepp</w:t>
+        <w:t>Betygskriterier: K1 Förändringsprocesser, händelser och personer samt olika tolkningar av dem; K2 Förlopp, orsaker och konsekvenser; K4 Samband mellan det förflutna och nutiden; K6 Historiska begrepp</w:t>
       </w:r>
     </w:p>
     <w:p>
@@ -1263,9 +2040,9 @@
         <w:rPr>
           <w:b w:val="0"/>
           <w:color w:val="555555"/>
-          <w:sz w:val="21"/>
+          <w:sz w:val="20"/>
         </w:rPr>
-        <w:t>Centralt innehåll: Demokratisering under 1800- och 1900-talen, Långsiktiga förändringsprocesser – kontinuitet och förändring, Förändrade maktförhållanden</w:t>
+        <w:t>Centralt innehåll: CI2 Industrialisering, demokratisering och globala förändringsprocesser; förändrade maktförhållanden och förklaringar till dem; CI3 Långsiktiga förändringsprocesser – kontinuitet och förändring</w:t>
       </w:r>
     </w:p>
     <w:p>
@@ -1466,7 +2243,7 @@
         <w:rPr>
           <w:b w:val="0"/>
           <w:color w:val="555555"/>
-          <w:sz w:val="21"/>
+          <w:sz w:val="20"/>
         </w:rPr>
         <w:t>Historiska begrepp: orsak, konsekvens, aktör, struktur</w:t>
       </w:r>
@@ -1480,9 +2257,9 @@
         <w:rPr>
           <w:b w:val="0"/>
           <w:color w:val="555555"/>
-          <w:sz w:val="21"/>
+          <w:sz w:val="20"/>
         </w:rPr>
-        <w:t>Betygskriterier som prövas: olika tolkningar, personers betydelse, orsaker och konsekvenser, historiska begrepp</w:t>
+        <w:t>Betygskriterier: K1 Förändringsprocesser, händelser och personer samt olika tolkningar av dem; K2 Förlopp, orsaker och konsekvenser; K3 Enskilda personers betydelse för skeenden; K6 Historiska begrepp</w:t>
       </w:r>
     </w:p>
     <w:p>
@@ -1494,9 +2271,9 @@
         <w:rPr>
           <w:b w:val="0"/>
           <w:color w:val="555555"/>
-          <w:sz w:val="21"/>
+          <w:sz w:val="20"/>
         </w:rPr>
-        <w:t>Centralt innehåll: Förändrade maktförhållanden och olika historiska förklaringar till dem, Statsbildning – långsiktiga förändringsprocesser</w:t>
+        <w:t>Centralt innehåll: CI2 Industrialisering, demokratisering och globala förändringsprocesser; förändrade maktförhållanden och förklaringar till dem; CI3 Långsiktiga förändringsprocesser – kontinuitet och förändring</w:t>
       </w:r>
     </w:p>
     <w:p>

</xml_diff>

<commit_message>
Mål-id som på kriteriesidan och uppgiftsfil för bedömningsskillen
- K-numren ersatta med lärarens mål-id (Gy25 1a, 1b, 2, 3, 4;
  Gy11 1a–1e, 2, 3a, 3b, 4a, 4b) i kursplaner, kriterie-JSON, prov och facit
- bygg_prov.py skriver <namn>_uppgift.txt i formatet som historia-bedomning
  läser; frågenumren följer Trelson-filen
- Fritextfrågorna får fältet vanliga_missforstand

Co-Authored-By: Claude Opus 5.5 <noreply@anthropic.com>
Claude-Session: https://claude.ai/code/session_01SkwDVysSJuMmZkNxibrjVq
</commit_message>
<xml_diff>
--- a/prov/det-langa-1800-talet-gy11/det-langa-1800-talet-gy11_facit.docx
+++ b/prov/det-langa-1800-talet-gy11/det-langa-1800-talet-gy11_facit.docx
@@ -52,7 +52,7 @@
           <w:b/>
           <w:sz w:val="22"/>
         </w:rPr>
-        <w:t>Betygskriterier som prövas (kursplan Gy-11)</w:t>
+        <w:t>Mål som prövas (id som på kriteriesidan) (kursplan Gy-11)</w:t>
       </w:r>
     </w:p>
     <w:tbl>
@@ -76,7 +76,7 @@
               <w:rPr>
                 <w:b/>
               </w:rPr>
-              <w:t>Nr</w:t>
+              <w:t>Id</w:t>
             </w:r>
           </w:p>
         </w:tc>
@@ -117,7 +117,7 @@
               <w:rPr>
                 <w:b/>
               </w:rPr>
-              <w:t>K1</w:t>
+              <w:t>1a</w:t>
             </w:r>
           </w:p>
         </w:tc>
@@ -130,7 +130,7 @@
               <w:rPr>
                 <w:sz w:val="20"/>
               </w:rPr>
-              <w:t>Förändringsprocesser, händelser och personer samt olika tolkningar av dem</w:t>
+              <w:t>Förändringar, händelser, personer och tolkningar</w:t>
             </w:r>
           </w:p>
         </w:tc>
@@ -158,7 +158,7 @@
               <w:rPr>
                 <w:b/>
               </w:rPr>
-              <w:t>K2</w:t>
+              <w:t>1b</w:t>
             </w:r>
           </w:p>
         </w:tc>
@@ -199,7 +199,7 @@
               <w:rPr>
                 <w:b/>
               </w:rPr>
-              <w:t>K3</w:t>
+              <w:t>1c</w:t>
             </w:r>
           </w:p>
         </w:tc>
@@ -212,7 +212,7 @@
               <w:rPr>
                 <w:sz w:val="20"/>
               </w:rPr>
-              <w:t>Enskilda personers betydelse för skeenden</w:t>
+              <w:t>Enskilda personers betydelse</w:t>
             </w:r>
           </w:p>
         </w:tc>
@@ -240,7 +240,7 @@
               <w:rPr>
                 <w:b/>
               </w:rPr>
-              <w:t>K4</w:t>
+              <w:t>1d</w:t>
             </w:r>
           </w:p>
         </w:tc>
@@ -253,7 +253,7 @@
               <w:rPr>
                 <w:sz w:val="20"/>
               </w:rPr>
-              <w:t>Samband mellan det förflutna och nutiden</w:t>
+              <w:t>Samband mellan då och nu</w:t>
             </w:r>
           </w:p>
         </w:tc>
@@ -282,7 +282,7 @@
                 <w:b/>
                 <w:color w:val="555555"/>
               </w:rPr>
-              <w:t>K5</w:t>
+              <w:t>1e</w:t>
             </w:r>
           </w:p>
         </w:tc>
@@ -296,7 +296,7 @@
                 <w:color w:val="555555"/>
                 <w:sz w:val="20"/>
               </w:rPr>
-              <w:t>Slutsatser om betydelse för framtiden</w:t>
+              <w:t>Slutsatser om framtiden</w:t>
             </w:r>
           </w:p>
         </w:tc>
@@ -325,7 +325,7 @@
               <w:rPr>
                 <w:b/>
               </w:rPr>
-              <w:t>K6</w:t>
+              <w:t>2</w:t>
             </w:r>
           </w:p>
         </w:tc>
@@ -338,7 +338,7 @@
               <w:rPr>
                 <w:sz w:val="20"/>
               </w:rPr>
-              <w:t>Historiska begrepp</w:t>
+              <w:t>Använda historiska begrepp</w:t>
             </w:r>
           </w:p>
         </w:tc>
@@ -367,7 +367,7 @@
                 <w:b/>
                 <w:color w:val="555555"/>
               </w:rPr>
-              <w:t>K7</w:t>
+              <w:t>3a</w:t>
             </w:r>
           </w:p>
         </w:tc>
@@ -381,7 +381,51 @@
                 <w:color w:val="555555"/>
                 <w:sz w:val="20"/>
               </w:rPr>
-              <w:t>Källmaterial och källkritik</w:t>
+              <w:t>Söka, granska och tolka källmaterial</w:t>
+            </w:r>
+          </w:p>
+        </w:tc>
+        <w:tc>
+          <w:tcPr>
+            <w:tcW w:type="dxa" w:w="1587"/>
+          </w:tcPr>
+          <w:p>
+            <w:r>
+              <w:rPr>
+                <w:color w:val="555555"/>
+                <w:sz w:val="20"/>
+              </w:rPr>
+              <w:t>–</w:t>
+            </w:r>
+          </w:p>
+        </w:tc>
+      </w:tr>
+      <w:tr>
+        <w:tc>
+          <w:tcPr>
+            <w:tcW w:type="dxa" w:w="794"/>
+          </w:tcPr>
+          <w:p>
+            <w:r>
+              <w:rPr>
+                <w:b/>
+                <w:color w:val="555555"/>
+              </w:rPr>
+              <w:t>3b</w:t>
+            </w:r>
+          </w:p>
+        </w:tc>
+        <w:tc>
+          <w:tcPr>
+            <w:tcW w:type="dxa" w:w="7030"/>
+          </w:tcPr>
+          <w:p>
+            <w:r>
+              <w:rPr>
+                <w:color w:val="555555"/>
+                <w:sz w:val="20"/>
+              </w:rPr>
+              <w:t>Källkritisk värdering</w:t>
             </w:r>
           </w:p>
         </w:tc>
@@ -410,7 +454,7 @@
               <w:rPr>
                 <w:b/>
               </w:rPr>
-              <w:t>K8</w:t>
+              <w:t>4a</w:t>
             </w:r>
           </w:p>
         </w:tc>
@@ -423,7 +467,48 @@
               <w:rPr>
                 <w:sz w:val="20"/>
               </w:rPr>
-              <w:t>Historiebruk</w:t>
+              <w:t>Redogöra för och förklara historiebruk</w:t>
+            </w:r>
+          </w:p>
+        </w:tc>
+        <w:tc>
+          <w:tcPr>
+            <w:tcW w:type="dxa" w:w="1587"/>
+          </w:tcPr>
+          <w:p>
+            <w:r>
+              <w:rPr>
+                <w:sz w:val="20"/>
+              </w:rPr>
+              <w:t>3</w:t>
+            </w:r>
+          </w:p>
+        </w:tc>
+      </w:tr>
+      <w:tr>
+        <w:tc>
+          <w:tcPr>
+            <w:tcW w:type="dxa" w:w="794"/>
+          </w:tcPr>
+          <w:p>
+            <w:r>
+              <w:rPr>
+                <w:b/>
+              </w:rPr>
+              <w:t>4b</w:t>
+            </w:r>
+          </w:p>
+        </w:tc>
+        <w:tc>
+          <w:tcPr>
+            <w:tcW w:type="dxa" w:w="7030"/>
+          </w:tcPr>
+          <w:p>
+            <w:r>
+              <w:rPr>
+                <w:sz w:val="20"/>
+              </w:rPr>
+              <w:t>Värdera historiebruk</w:t>
             </w:r>
           </w:p>
         </w:tc>
@@ -476,7 +561,7 @@
               <w:rPr>
                 <w:b/>
               </w:rPr>
-              <w:t>Nr</w:t>
+              <w:t>Id</w:t>
             </w:r>
           </w:p>
         </w:tc>
@@ -787,7 +872,7 @@
           <w:color w:val="555555"/>
           <w:sz w:val="20"/>
         </w:rPr>
-        <w:t>Betygskriterier: K1 Förändringsprocesser, händelser och personer samt olika tolkningar av dem; K2 Förlopp, orsaker och konsekvenser</w:t>
+        <w:t>Mål: 1a Förändringar, händelser, personer och tolkningar; 1b Förlopp, orsaker och konsekvenser</w:t>
       </w:r>
     </w:p>
     <w:p>
@@ -1623,7 +1708,7 @@
           <w:color w:val="555555"/>
           <w:sz w:val="20"/>
         </w:rPr>
-        <w:t>Betygskriterier: K1 Förändringsprocesser, händelser och personer samt olika tolkningar av dem</w:t>
+        <w:t>Mål: 1a Förändringar, händelser, personer och tolkningar</w:t>
       </w:r>
     </w:p>
     <w:p>
@@ -1794,7 +1879,7 @@
           <w:color w:val="555555"/>
           <w:sz w:val="20"/>
         </w:rPr>
-        <w:t>Betygskriterier: K4 Samband mellan det förflutna och nutiden; K8 Historiebruk</w:t>
+        <w:t>Mål: 1d Samband mellan då och nu; 4a Redogöra för och förklara historiebruk; 4b Värdera historiebruk</w:t>
       </w:r>
     </w:p>
     <w:p>
@@ -2028,7 +2113,7 @@
           <w:color w:val="555555"/>
           <w:sz w:val="20"/>
         </w:rPr>
-        <w:t>Betygskriterier: K1 Förändringsprocesser, händelser och personer samt olika tolkningar av dem; K2 Förlopp, orsaker och konsekvenser; K4 Samband mellan det förflutna och nutiden; K6 Historiska begrepp</w:t>
+        <w:t>Mål: 1a Förändringar, händelser, personer och tolkningar; 1b Förlopp, orsaker och konsekvenser; 1d Samband mellan då och nu; 2 Använda historiska begrepp</w:t>
       </w:r>
     </w:p>
     <w:p>
@@ -2259,7 +2344,7 @@
           <w:color w:val="555555"/>
           <w:sz w:val="20"/>
         </w:rPr>
-        <w:t>Betygskriterier: K1 Förändringsprocesser, händelser och personer samt olika tolkningar av dem; K2 Förlopp, orsaker och konsekvenser; K3 Enskilda personers betydelse för skeenden; K6 Historiska begrepp</w:t>
+        <w:t>Mål: 1a Förändringar, händelser, personer och tolkningar; 1b Förlopp, orsaker och konsekvenser; 1c Enskilda personers betydelse; 2 Använda historiska begrepp</w:t>
       </w:r>
     </w:p>
     <w:p>

</xml_diff>